<commit_message>
fix(documentos): correcciones integrales en plantillas docx, integracion etiquetas y adjuntos institucionales acordadas en la reunion del dia 16/10
</commit_message>
<xml_diff>
--- a/packages/domain/plantillas/maestras/1tesista/ETAPA01/CARATULA_PLAN DE TESIS.docx
+++ b/packages/domain/plantillas/maestras/1tesista/ETAPA01/CARATULA_PLAN DE TESIS.docx
@@ -662,23 +662,38 @@
         <w:ind w:left="3686" w:firstLine="0"/>
         <w:jc w:val="both"/>
         <w:rPr>
-          <w:sz w:val="24"/>
-          <w:szCs w:val="24"/>
-        </w:rPr>
-      </w:pPr>
-      <w:r>
-        <w:rPr>
-          <w:sz w:val="24"/>
-          <w:szCs w:val="24"/>
+          <w:rFonts w:ascii="Calibri" w:cs="Calibri" w:eastAsia="Calibri" w:hAnsi="Calibri"/>
+          <w:sz w:val="24"/>
+          <w:szCs w:val="24"/>
+        </w:rPr>
+      </w:pPr>
+      <w:r>
+        <w:rPr>
+          <w:rFonts w:ascii="Calibri" w:cs="Calibri" w:eastAsia="Calibri" w:hAnsi="Calibri"/>
+          <w:sz w:val="24"/>
+          <w:szCs w:val="24"/>
+          <w:rtl w:val="0"/>
         </w:rPr>
         <w:t xml:space="preserve">Coasesor: </w:t>
       </w:r>
-      <w:r>
-        <w:rPr>
-          <w:sz w:val="24"/>
-          <w:szCs w:val="24"/>
-        </w:rPr>
-        <w:t>&lt;&lt;COASESOR&gt;&gt;</w:t>
+    </w:p>
+    <w:p>
+      <w:pPr>
+        <w:ind w:left="3686" w:firstLine="0"/>
+        <w:jc w:val="both"/>
+        <w:rPr>
+          <w:rFonts w:ascii="Calibri" w:cs="Calibri" w:eastAsia="Calibri" w:hAnsi="Calibri"/>
+          <w:sz w:val="24"/>
+          <w:szCs w:val="24"/>
+        </w:rPr>
+      </w:pPr>
+      <w:r>
+        <w:rPr>
+          <w:sz w:val="24"/>
+          <w:szCs w:val="24"/>
+          <w:rtl w:val="0"/>
+        </w:rPr>
+        <w:t xml:space="preserve">&lt;&lt;COASESOR&gt;&gt;</w:t>
       </w:r>
     </w:p>
     <w:p>

</xml_diff>